<commit_message>
fixex in 2.3 and 2.2
</commit_message>
<xml_diff>
--- a/magistritöö Buketov.docx
+++ b/magistritöö Buketov.docx
@@ -563,9 +563,9 @@
         <w:br w:type="page"/>
       </w:r>
     </w:p>
-    <w:bookmarkStart w:id="1" w:name="_Toc190518902" w:displacedByCustomXml="next"/>
+    <w:bookmarkStart w:id="1" w:name="_Toc183856778" w:displacedByCustomXml="next"/>
     <w:bookmarkStart w:id="2" w:name="_Toc183952981" w:displacedByCustomXml="next"/>
-    <w:bookmarkStart w:id="3" w:name="_Toc183856778" w:displacedByCustomXml="next"/>
+    <w:bookmarkStart w:id="3" w:name="_Toc190518902" w:displacedByCustomXml="next"/>
     <w:sdt>
       <w:sdtPr>
         <w:rPr>
@@ -950,23 +950,7 @@
                 <w:rFonts w:ascii="Cambria" w:hAnsi="Cambria"/>
                 <w:lang w:val="en-US"/>
               </w:rPr>
-              <w:t>Automatiseerimine hari</w:t>
-            </w:r>
-            <w:r>
-              <w:rPr>
-                <w:rStyle w:val="Hyperlink"/>
-                <w:rFonts w:ascii="Cambria" w:hAnsi="Cambria"/>
-                <w:lang w:val="en-US"/>
-              </w:rPr>
-              <w:t>d</w:t>
-            </w:r>
-            <w:r>
-              <w:rPr>
-                <w:rStyle w:val="Hyperlink"/>
-                <w:rFonts w:ascii="Cambria" w:hAnsi="Cambria"/>
-                <w:lang w:val="en-US"/>
-              </w:rPr>
-              <w:t>uses: eesmärgid ja mõju</w:t>
+              <w:t>Automatiseerimine hariduses: eesmärgid ja mõju</w:t>
             </w:r>
             <w:r>
               <w:rPr>
@@ -5757,6 +5741,7 @@
     </w:p>
     <w:p>
       <w:pPr>
+        <w:spacing w:line="240" w:lineRule="auto"/>
         <w:rPr>
           <w:rFonts w:ascii="Cambria" w:hAnsi="Cambria"/>
           <w:sz w:val="24"/>
@@ -5784,6 +5769,7 @@
     </w:p>
     <w:p>
       <w:pPr>
+        <w:spacing w:line="240" w:lineRule="auto"/>
         <w:rPr>
           <w:rFonts w:ascii="Cambria" w:hAnsi="Cambria"/>
           <w:sz w:val="24"/>
@@ -5821,6 +5807,7 @@
     </w:p>
     <w:p>
       <w:pPr>
+        <w:spacing w:line="240" w:lineRule="auto"/>
         <w:rPr>
           <w:rFonts w:ascii="Cambria" w:hAnsi="Cambria"/>
           <w:sz w:val="24"/>
@@ -5838,6 +5825,7 @@
     </w:p>
     <w:p>
       <w:pPr>
+        <w:spacing w:line="240" w:lineRule="auto"/>
         <w:rPr>
           <w:rFonts w:ascii="Cambria" w:hAnsi="Cambria"/>
           <w:sz w:val="24"/>
@@ -5866,6 +5854,7 @@
     </w:p>
     <w:p>
       <w:pPr>
+        <w:spacing w:line="240" w:lineRule="auto"/>
         <w:rPr>
           <w:rFonts w:ascii="Cambria" w:hAnsi="Cambria"/>
           <w:sz w:val="24"/>
@@ -5879,29 +5868,21 @@
           <w:sz w:val="24"/>
           <w:szCs w:val="24"/>
         </w:rPr>
-        <w:t xml:space="preserve">Töö tulemuste põhjal tehakse järeldused automatiseerimise mõjust haridusasutuste töövoogude efektiivsusele ning määratakse kindlaks võimalikud edasised </w:t>
-      </w:r>
-      <w:r>
-        <w:rPr>
-          <w:rFonts w:ascii="Cambria" w:hAnsi="Cambria"/>
-          <w:sz w:val="24"/>
-          <w:szCs w:val="24"/>
-        </w:rPr>
-        <w:lastRenderedPageBreak/>
-        <w:t>arendussuunad, mis võivad hõlmata täiendavaid funktsioone, nagu tehisintellektil põhinev analüütika või andmevahetuse parandamine olemasolevate süsteemidega.</w:t>
-      </w:r>
-    </w:p>
-    <w:p>
-      <w:pPr>
-        <w:rPr>
-          <w:rFonts w:ascii="Cambria" w:hAnsi="Cambria"/>
-          <w:sz w:val="24"/>
-          <w:szCs w:val="24"/>
-        </w:rPr>
-      </w:pPr>
-    </w:p>
-    <w:p>
-      <w:pPr>
+        <w:t>Töö tulemuste põhjal tehakse järeldused automatiseerimise mõjust haridusasutuste töövoogude efektiivsusele ning määratakse kindlaks võimalikud edasised arendussuunad, mis võivad hõlmata täiendavaid funktsioone, nagu tehisintellektil põhinev analüütika või andmevahetuse parandamine olemasolevate süsteemidega.</w:t>
+      </w:r>
+    </w:p>
+    <w:p>
+      <w:pPr>
+        <w:rPr>
+          <w:rFonts w:ascii="Cambria" w:hAnsi="Cambria"/>
+          <w:sz w:val="24"/>
+          <w:szCs w:val="24"/>
+        </w:rPr>
+      </w:pPr>
+    </w:p>
+    <w:p>
+      <w:pPr>
+        <w:spacing w:line="240" w:lineRule="auto"/>
         <w:rPr>
           <w:rFonts w:ascii="Cambria" w:hAnsi="Cambria"/>
           <w:sz w:val="24"/>
@@ -6187,6 +6168,7 @@
           <w:ilvl w:val="0"/>
           <w:numId w:val="50"/>
         </w:numPr>
+        <w:spacing w:line="240" w:lineRule="auto"/>
         <w:rPr>
           <w:rFonts w:ascii="Cambria" w:hAnsi="Cambria"/>
           <w:sz w:val="24"/>
@@ -6420,6 +6402,7 @@
           <w:ilvl w:val="0"/>
           <w:numId w:val="50"/>
         </w:numPr>
+        <w:spacing w:line="240" w:lineRule="auto"/>
         <w:rPr>
           <w:rFonts w:ascii="Cambria" w:hAnsi="Cambria"/>
           <w:sz w:val="24"/>
@@ -6484,6 +6467,7 @@
           <w:ilvl w:val="0"/>
           <w:numId w:val="19"/>
         </w:numPr>
+        <w:spacing w:line="240" w:lineRule="auto"/>
         <w:rPr>
           <w:rFonts w:ascii="Cambria" w:hAnsi="Cambria"/>
           <w:sz w:val="24"/>
@@ -6517,6 +6501,7 @@
           <w:ilvl w:val="0"/>
           <w:numId w:val="19"/>
         </w:numPr>
+        <w:spacing w:line="240" w:lineRule="auto"/>
         <w:rPr>
           <w:rFonts w:ascii="Cambria" w:hAnsi="Cambria"/>
           <w:sz w:val="24"/>
@@ -6559,6 +6544,7 @@
           <w:ilvl w:val="0"/>
           <w:numId w:val="19"/>
         </w:numPr>
+        <w:spacing w:line="240" w:lineRule="auto"/>
         <w:rPr>
           <w:rFonts w:ascii="Cambria" w:hAnsi="Cambria"/>
           <w:sz w:val="24"/>
@@ -6592,6 +6578,7 @@
           <w:ilvl w:val="0"/>
           <w:numId w:val="19"/>
         </w:numPr>
+        <w:spacing w:line="240" w:lineRule="auto"/>
         <w:rPr>
           <w:rFonts w:ascii="Cambria" w:hAnsi="Cambria"/>
           <w:sz w:val="24"/>
@@ -6625,6 +6612,7 @@
           <w:ilvl w:val="0"/>
           <w:numId w:val="19"/>
         </w:numPr>
+        <w:spacing w:line="240" w:lineRule="auto"/>
         <w:rPr>
           <w:rFonts w:ascii="Cambria" w:hAnsi="Cambria"/>
           <w:sz w:val="24"/>
@@ -6658,6 +6646,7 @@
           <w:ilvl w:val="0"/>
           <w:numId w:val="19"/>
         </w:numPr>
+        <w:spacing w:line="240" w:lineRule="auto"/>
         <w:rPr>
           <w:rFonts w:ascii="Cambria" w:hAnsi="Cambria"/>
           <w:sz w:val="24"/>
@@ -6691,6 +6680,7 @@
           <w:ilvl w:val="0"/>
           <w:numId w:val="19"/>
         </w:numPr>
+        <w:spacing w:line="240" w:lineRule="auto"/>
         <w:rPr>
           <w:rFonts w:ascii="Cambria" w:hAnsi="Cambria"/>
           <w:sz w:val="24"/>
@@ -6706,7 +6696,6 @@
           <w:sz w:val="24"/>
           <w:szCs w:val="24"/>
         </w:rPr>
-        <w:lastRenderedPageBreak/>
         <w:t>Kokkuvõte ja töö väärtuse hindamine</w:t>
       </w:r>
       <w:r>
@@ -6717,6 +6706,21 @@
         </w:rPr>
         <w:t xml:space="preserve"> – võetakse kokku töö peamised järeldused ja nende rakendatavus.</w:t>
       </w:r>
+    </w:p>
+    <w:p>
+      <w:pPr>
+        <w:pStyle w:val="ListParagraph"/>
+        <w:numPr>
+          <w:ilvl w:val="0"/>
+          <w:numId w:val="19"/>
+        </w:numPr>
+        <w:rPr>
+          <w:rFonts w:ascii="Cambria" w:hAnsi="Cambria"/>
+          <w:sz w:val="24"/>
+          <w:szCs w:val="24"/>
+          <w:lang w:val="en-GB"/>
+        </w:rPr>
+      </w:pPr>
       <w:r>
         <w:rPr>
           <w:rFonts w:ascii="Cambria" w:hAnsi="Cambria"/>
@@ -8164,10 +8168,7 @@
       <w:pPr>
         <w:spacing w:line="240" w:lineRule="auto"/>
         <w:rPr>
-          <w:rFonts w:ascii="Cambria" w:hAnsi="Cambria"/>
-          <w:sz w:val="24"/>
-          <w:szCs w:val="24"/>
-          <w:lang w:val="en-GB"/>
+          <w:lang w:val="ru-RU"/>
         </w:rPr>
       </w:pPr>
       <w:r>
@@ -9357,7 +9358,7 @@
           <w:rFonts w:ascii="Cambria" w:hAnsi="Cambria"/>
           <w:sz w:val="24"/>
           <w:szCs w:val="24"/>
-          <w:lang w:val="en-GB"/>
+          <w:lang w:val="ru-RU"/>
         </w:rPr>
       </w:pPr>
       <w:r>
@@ -9369,6 +9370,17 @@
         </w:rPr>
         <w:t>ISO 30401 on rahvusvaheline standard, mis määratleb teadmiste haldamise süsteemide (KMS) nõuded. See on eriti oluline haridusasutustes, kus teadmiste loomine, säilitamine ja jagamine on kriitilise tähtsusega protsesside tõhususe ning organisatsiooni jätkusuutlikkuse tagamiseks. Standard aitab haridusasutustel süstemaatiliselt hallata teadmisi, et parandada otsustusprotsesse, suurendada organisatsiooni õppimisvõimekust ja tõhustada innovatsiooni.</w:t>
       </w:r>
+    </w:p>
+    <w:p>
+      <w:pPr>
+        <w:spacing w:line="240" w:lineRule="auto"/>
+        <w:rPr>
+          <w:rFonts w:ascii="Cambria" w:hAnsi="Cambria"/>
+          <w:sz w:val="24"/>
+          <w:szCs w:val="24"/>
+          <w:lang w:val="ru-RU"/>
+        </w:rPr>
+      </w:pPr>
     </w:p>
     <w:p>
       <w:pPr>
@@ -9379,7 +9391,7 @@
           <w:bCs/>
           <w:sz w:val="24"/>
           <w:szCs w:val="24"/>
-          <w:lang w:val="en-GB"/>
+          <w:lang w:val="ru-RU"/>
         </w:rPr>
       </w:pPr>
       <w:r>
@@ -9393,6 +9405,19 @@
         </w:rPr>
         <w:t>ISO 30401 põhieesmärgid ja põhiprintsiibid</w:t>
       </w:r>
+    </w:p>
+    <w:p>
+      <w:pPr>
+        <w:spacing w:line="240" w:lineRule="auto"/>
+        <w:rPr>
+          <w:rFonts w:ascii="Cambria" w:hAnsi="Cambria"/>
+          <w:b/>
+          <w:bCs/>
+          <w:sz w:val="24"/>
+          <w:szCs w:val="24"/>
+          <w:lang w:val="ru-RU"/>
+        </w:rPr>
+      </w:pPr>
     </w:p>
     <w:p>
       <w:pPr>
@@ -9542,6 +9567,7 @@
           <w:szCs w:val="24"/>
           <w:lang w:val="en-GB"/>
         </w:rPr>
+        <w:lastRenderedPageBreak/>
         <w:t>Luua süsteemne lähenemine teadmiste haldamisele</w:t>
       </w:r>
       <w:r>
@@ -9557,11 +9583,23 @@
     <w:p>
       <w:pPr>
         <w:spacing w:line="240" w:lineRule="auto"/>
-        <w:rPr>
-          <w:rFonts w:ascii="Cambria" w:hAnsi="Cambria"/>
-          <w:sz w:val="24"/>
-          <w:szCs w:val="24"/>
-          <w:lang w:val="en-GB"/>
+        <w:ind w:left="360"/>
+        <w:rPr>
+          <w:rFonts w:ascii="Cambria" w:hAnsi="Cambria"/>
+          <w:sz w:val="24"/>
+          <w:szCs w:val="24"/>
+          <w:lang w:val="en-GB"/>
+        </w:rPr>
+      </w:pPr>
+    </w:p>
+    <w:p>
+      <w:pPr>
+        <w:spacing w:line="240" w:lineRule="auto"/>
+        <w:rPr>
+          <w:rFonts w:ascii="Cambria" w:hAnsi="Cambria"/>
+          <w:sz w:val="24"/>
+          <w:szCs w:val="24"/>
+          <w:lang w:val="ru-RU"/>
         </w:rPr>
       </w:pPr>
       <w:r>
@@ -9573,6 +9611,17 @@
         </w:rPr>
         <w:t>Standardi põhiprintsiibid hõlmavad:</w:t>
       </w:r>
+    </w:p>
+    <w:p>
+      <w:pPr>
+        <w:spacing w:line="240" w:lineRule="auto"/>
+        <w:rPr>
+          <w:rFonts w:ascii="Cambria" w:hAnsi="Cambria"/>
+          <w:sz w:val="24"/>
+          <w:szCs w:val="24"/>
+          <w:lang w:val="ru-RU"/>
+        </w:rPr>
+      </w:pPr>
     </w:p>
     <w:p>
       <w:pPr>
@@ -9597,7 +9646,6 @@
           <w:szCs w:val="24"/>
           <w:lang w:val="en-GB"/>
         </w:rPr>
-        <w:lastRenderedPageBreak/>
         <w:t>Teadmiste väärtustamine</w:t>
       </w:r>
       <w:r>
@@ -10253,6 +10301,7 @@
           <w:szCs w:val="24"/>
           <w:lang w:val="en-GB"/>
         </w:rPr>
+        <w:lastRenderedPageBreak/>
         <w:t>Tõhusam otsustusprotsess</w:t>
       </w:r>
       <w:r>
@@ -10332,7 +10381,7 @@
           <w:szCs w:val="24"/>
           <w:lang w:val="en-GB"/>
         </w:rPr>
-        <w:t xml:space="preserve"> – dokumenteeritud ja struktureeritud teadmised vähendavad kriitilise teabe kadumise riski töötajate lahkumisel.</w:t>
+        <w:t xml:space="preserve"> – dokumenteeritud ja struktureeritud teadmised vähendvad kriitilise teabe kadumise riski töötajate lahkumisel.</w:t>
       </w:r>
     </w:p>
     <w:p>
@@ -10347,19 +10396,22 @@
       <w:tblPr>
         <w:tblStyle w:val="TableGrid"/>
         <w:tblW w:w="0" w:type="auto"/>
+        <w:jc w:val="center"/>
         <w:tblLook w:val="04A0" w:firstRow="1" w:lastRow="0" w:firstColumn="1" w:lastColumn="0" w:noHBand="0" w:noVBand="1"/>
       </w:tblPr>
       <w:tblGrid>
-        <w:gridCol w:w="1223"/>
-        <w:gridCol w:w="1969"/>
-        <w:gridCol w:w="2218"/>
-        <w:gridCol w:w="1286"/>
-        <w:gridCol w:w="2082"/>
+        <w:gridCol w:w="1088"/>
+        <w:gridCol w:w="1764"/>
+        <w:gridCol w:w="1981"/>
+        <w:gridCol w:w="1922"/>
       </w:tblGrid>
       <w:tr>
+        <w:trPr>
+          <w:jc w:val="center"/>
+        </w:trPr>
         <w:tc>
           <w:tcPr>
-            <w:tcW w:w="1223" w:type="dxa"/>
+            <w:tcW w:w="1088" w:type="dxa"/>
           </w:tcPr>
           <w:p>
             <w:pPr>
@@ -10367,6 +10419,7 @@
                 <w:tab w:val="clear" w:pos="6237"/>
               </w:tabs>
               <w:spacing w:line="240" w:lineRule="auto"/>
+              <w:jc w:val="center"/>
               <w:rPr>
                 <w:rFonts w:ascii="Cambria" w:hAnsi="Cambria"/>
                 <w:b/>
@@ -10383,6 +10436,8 @@
           </w:p>
           <w:p>
             <w:pPr>
+              <w:spacing w:line="240" w:lineRule="auto"/>
+              <w:jc w:val="center"/>
               <w:rPr>
                 <w:rFonts w:ascii="Cambria" w:hAnsi="Cambria"/>
                 <w:lang w:val="ru-RU"/>
@@ -10392,7 +10447,7 @@
         </w:tc>
         <w:tc>
           <w:tcPr>
-            <w:tcW w:w="1969" w:type="dxa"/>
+            <w:tcW w:w="1764" w:type="dxa"/>
           </w:tcPr>
           <w:p>
             <w:pPr>
@@ -10400,6 +10455,7 @@
                 <w:tab w:val="clear" w:pos="6237"/>
               </w:tabs>
               <w:spacing w:line="240" w:lineRule="auto"/>
+              <w:jc w:val="center"/>
               <w:rPr>
                 <w:rFonts w:ascii="Cambria" w:hAnsi="Cambria"/>
                 <w:b/>
@@ -10416,6 +10472,8 @@
           </w:p>
           <w:p>
             <w:pPr>
+              <w:spacing w:line="240" w:lineRule="auto"/>
+              <w:jc w:val="center"/>
               <w:rPr>
                 <w:rFonts w:ascii="Cambria" w:hAnsi="Cambria"/>
                 <w:lang w:val="ru-RU"/>
@@ -10425,7 +10483,7 @@
         </w:tc>
         <w:tc>
           <w:tcPr>
-            <w:tcW w:w="2218" w:type="dxa"/>
+            <w:tcW w:w="1981" w:type="dxa"/>
           </w:tcPr>
           <w:p>
             <w:pPr>
@@ -10433,6 +10491,7 @@
                 <w:tab w:val="clear" w:pos="6237"/>
               </w:tabs>
               <w:spacing w:line="240" w:lineRule="auto"/>
+              <w:jc w:val="center"/>
               <w:rPr>
                 <w:rFonts w:ascii="Cambria" w:hAnsi="Cambria"/>
                 <w:b/>
@@ -10444,11 +10503,13 @@
                 <w:rStyle w:val="Strong"/>
                 <w:rFonts w:ascii="Cambria" w:hAnsi="Cambria"/>
               </w:rPr>
-              <w:t>Põhimõtted</w:t>
+              <w:t>Peamised nõuded</w:t>
             </w:r>
           </w:p>
           <w:p>
             <w:pPr>
+              <w:spacing w:line="240" w:lineRule="auto"/>
+              <w:jc w:val="center"/>
               <w:rPr>
                 <w:rFonts w:ascii="Cambria" w:hAnsi="Cambria"/>
                 <w:lang w:val="ru-RU"/>
@@ -10458,7 +10519,7 @@
         </w:tc>
         <w:tc>
           <w:tcPr>
-            <w:tcW w:w="1286" w:type="dxa"/>
+            <w:tcW w:w="1922" w:type="dxa"/>
           </w:tcPr>
           <w:p>
             <w:pPr>
@@ -10466,6 +10527,7 @@
                 <w:tab w:val="clear" w:pos="6237"/>
               </w:tabs>
               <w:spacing w:line="240" w:lineRule="auto"/>
+              <w:jc w:val="center"/>
               <w:rPr>
                 <w:rFonts w:ascii="Cambria" w:hAnsi="Cambria"/>
                 <w:b/>
@@ -10477,44 +10539,13 @@
                 <w:rStyle w:val="Strong"/>
                 <w:rFonts w:ascii="Cambria" w:hAnsi="Cambria"/>
               </w:rPr>
-              <w:t>Peamised nõuded</w:t>
+              <w:t>Rakendusalad</w:t>
             </w:r>
           </w:p>
           <w:p>
             <w:pPr>
-              <w:rPr>
-                <w:rFonts w:ascii="Cambria" w:hAnsi="Cambria"/>
-                <w:lang w:val="ru-RU"/>
-              </w:rPr>
-            </w:pPr>
-          </w:p>
-        </w:tc>
-        <w:tc>
-          <w:tcPr>
-            <w:tcW w:w="2082" w:type="dxa"/>
-          </w:tcPr>
-          <w:p>
-            <w:pPr>
-              <w:tabs>
-                <w:tab w:val="clear" w:pos="6237"/>
-              </w:tabs>
               <w:spacing w:line="240" w:lineRule="auto"/>
-              <w:rPr>
-                <w:rFonts w:ascii="Cambria" w:hAnsi="Cambria"/>
-                <w:b/>
-                <w:bCs/>
-              </w:rPr>
-            </w:pPr>
-            <w:r>
-              <w:rPr>
-                <w:rStyle w:val="Strong"/>
-                <w:rFonts w:ascii="Cambria" w:hAnsi="Cambria"/>
-              </w:rPr>
-              <w:t>Rakendusalad</w:t>
-            </w:r>
-          </w:p>
-          <w:p>
-            <w:pPr>
+              <w:jc w:val="center"/>
               <w:rPr>
                 <w:rFonts w:ascii="Cambria" w:hAnsi="Cambria"/>
                 <w:lang w:val="ru-RU"/>
@@ -10524,9 +10555,12 @@
         </w:tc>
       </w:tr>
       <w:tr>
+        <w:trPr>
+          <w:jc w:val="center"/>
+        </w:trPr>
         <w:tc>
           <w:tcPr>
-            <w:tcW w:w="1223" w:type="dxa"/>
+            <w:tcW w:w="1088" w:type="dxa"/>
             <w:vMerge w:val="restart"/>
           </w:tcPr>
           <w:p>
@@ -10535,6 +10569,7 @@
                 <w:tab w:val="clear" w:pos="6237"/>
               </w:tabs>
               <w:spacing w:line="240" w:lineRule="auto"/>
+              <w:jc w:val="center"/>
               <w:rPr>
                 <w:rFonts w:ascii="Cambria" w:hAnsi="Cambria"/>
                 <w:lang w:val="ru-RU"/>
@@ -10551,7 +10586,7 @@
         </w:tc>
         <w:tc>
           <w:tcPr>
-            <w:tcW w:w="1969" w:type="dxa"/>
+            <w:tcW w:w="1764" w:type="dxa"/>
             <w:vMerge w:val="restart"/>
           </w:tcPr>
           <w:p>
@@ -10560,6 +10595,7 @@
                 <w:tab w:val="clear" w:pos="6237"/>
               </w:tabs>
               <w:spacing w:line="240" w:lineRule="auto"/>
+              <w:jc w:val="center"/>
               <w:rPr>
                 <w:rFonts w:ascii="Cambria" w:hAnsi="Cambria"/>
               </w:rPr>
@@ -10573,6 +10609,8 @@
           </w:p>
           <w:p>
             <w:pPr>
+              <w:spacing w:line="240" w:lineRule="auto"/>
+              <w:jc w:val="center"/>
               <w:rPr>
                 <w:rFonts w:ascii="Cambria" w:hAnsi="Cambria"/>
               </w:rPr>
@@ -10581,33 +10619,28 @@
         </w:tc>
         <w:tc>
           <w:tcPr>
-            <w:tcW w:w="2218" w:type="dxa"/>
+            <w:tcW w:w="1981" w:type="dxa"/>
           </w:tcPr>
           <w:p>
             <w:pPr>
+              <w:spacing w:line="240" w:lineRule="auto"/>
+              <w:jc w:val="center"/>
               <w:rPr>
                 <w:rFonts w:ascii="Cambria" w:hAnsi="Cambria"/>
                 <w:lang w:val="en-GB"/>
               </w:rPr>
             </w:pPr>
+            <w:r>
+              <w:rPr>
+                <w:rFonts w:ascii="Cambria" w:hAnsi="Cambria"/>
+              </w:rPr>
+              <w:t>Süstemaatiline teadmiste haldamine ja dokumenteerimine</w:t>
+            </w:r>
           </w:p>
         </w:tc>
         <w:tc>
           <w:tcPr>
-            <w:tcW w:w="1286" w:type="dxa"/>
-          </w:tcPr>
-          <w:p>
-            <w:pPr>
-              <w:rPr>
-                <w:rFonts w:ascii="Cambria" w:hAnsi="Cambria"/>
-                <w:lang w:val="en-GB"/>
-              </w:rPr>
-            </w:pPr>
-          </w:p>
-        </w:tc>
-        <w:tc>
-          <w:tcPr>
-            <w:tcW w:w="2082" w:type="dxa"/>
+            <w:tcW w:w="1922" w:type="dxa"/>
           </w:tcPr>
           <w:p>
             <w:pPr>
@@ -10615,6 +10648,7 @@
                 <w:tab w:val="clear" w:pos="6237"/>
               </w:tabs>
               <w:spacing w:line="240" w:lineRule="auto"/>
+              <w:jc w:val="center"/>
               <w:rPr>
                 <w:rFonts w:ascii="Cambria" w:hAnsi="Cambria"/>
               </w:rPr>
@@ -10623,11 +10657,13 @@
               <w:rPr>
                 <w:rFonts w:ascii="Cambria" w:hAnsi="Cambria"/>
               </w:rPr>
-              <w:t xml:space="preserve">Õppekorralduse ja kvaliteedijuhtimise parendamine. </w:t>
+              <w:t>Õppekorralduse ja kvaliteedijuhtimise parendamine.</w:t>
             </w:r>
           </w:p>
           <w:p>
             <w:pPr>
+              <w:spacing w:line="240" w:lineRule="auto"/>
+              <w:jc w:val="center"/>
               <w:rPr>
                 <w:rFonts w:ascii="Cambria" w:hAnsi="Cambria"/>
                 <w:lang w:val="en-GB"/>
@@ -10637,13 +10673,18 @@
         </w:tc>
       </w:tr>
       <w:tr>
+        <w:trPr>
+          <w:jc w:val="center"/>
+        </w:trPr>
         <w:tc>
           <w:tcPr>
-            <w:tcW w:w="1223" w:type="dxa"/>
+            <w:tcW w:w="1088" w:type="dxa"/>
             <w:vMerge/>
           </w:tcPr>
           <w:p>
             <w:pPr>
+              <w:spacing w:line="240" w:lineRule="auto"/>
+              <w:jc w:val="center"/>
               <w:rPr>
                 <w:rFonts w:ascii="Cambria" w:hAnsi="Cambria"/>
                 <w:lang w:val="en-GB"/>
@@ -10653,11 +10694,13 @@
         </w:tc>
         <w:tc>
           <w:tcPr>
-            <w:tcW w:w="1969" w:type="dxa"/>
+            <w:tcW w:w="1764" w:type="dxa"/>
             <w:vMerge/>
           </w:tcPr>
           <w:p>
             <w:pPr>
+              <w:spacing w:line="240" w:lineRule="auto"/>
+              <w:jc w:val="center"/>
               <w:rPr>
                 <w:rFonts w:ascii="Cambria" w:hAnsi="Cambria"/>
                 <w:lang w:val="en-GB"/>
@@ -10667,33 +10710,28 @@
         </w:tc>
         <w:tc>
           <w:tcPr>
-            <w:tcW w:w="2218" w:type="dxa"/>
+            <w:tcW w:w="1981" w:type="dxa"/>
           </w:tcPr>
           <w:p>
             <w:pPr>
+              <w:spacing w:line="240" w:lineRule="auto"/>
+              <w:jc w:val="center"/>
               <w:rPr>
                 <w:rFonts w:ascii="Cambria" w:hAnsi="Cambria"/>
                 <w:lang w:val="en-GB"/>
               </w:rPr>
             </w:pPr>
+            <w:r>
+              <w:rPr>
+                <w:rFonts w:ascii="Cambria" w:hAnsi="Cambria"/>
+              </w:rPr>
+              <w:t>Juurdepääs ja teadmiste kättesaadavuse tagamine</w:t>
+            </w:r>
           </w:p>
         </w:tc>
         <w:tc>
           <w:tcPr>
-            <w:tcW w:w="1286" w:type="dxa"/>
-          </w:tcPr>
-          <w:p>
-            <w:pPr>
-              <w:rPr>
-                <w:rFonts w:ascii="Cambria" w:hAnsi="Cambria"/>
-                <w:lang w:val="en-GB"/>
-              </w:rPr>
-            </w:pPr>
-          </w:p>
-        </w:tc>
-        <w:tc>
-          <w:tcPr>
-            <w:tcW w:w="2082" w:type="dxa"/>
+            <w:tcW w:w="1922" w:type="dxa"/>
           </w:tcPr>
           <w:p>
             <w:pPr>
@@ -10701,6 +10739,7 @@
                 <w:tab w:val="clear" w:pos="6237"/>
               </w:tabs>
               <w:spacing w:line="240" w:lineRule="auto"/>
+              <w:jc w:val="center"/>
               <w:rPr>
                 <w:rFonts w:ascii="Cambria" w:hAnsi="Cambria"/>
               </w:rPr>
@@ -10714,6 +10753,8 @@
           </w:p>
           <w:p>
             <w:pPr>
+              <w:spacing w:line="240" w:lineRule="auto"/>
+              <w:jc w:val="center"/>
               <w:rPr>
                 <w:rFonts w:ascii="Cambria" w:hAnsi="Cambria"/>
                 <w:lang w:val="en-GB"/>
@@ -10723,13 +10764,18 @@
         </w:tc>
       </w:tr>
       <w:tr>
+        <w:trPr>
+          <w:jc w:val="center"/>
+        </w:trPr>
         <w:tc>
           <w:tcPr>
-            <w:tcW w:w="1223" w:type="dxa"/>
+            <w:tcW w:w="1088" w:type="dxa"/>
             <w:vMerge/>
           </w:tcPr>
           <w:p>
             <w:pPr>
+              <w:spacing w:line="240" w:lineRule="auto"/>
+              <w:jc w:val="center"/>
               <w:rPr>
                 <w:rFonts w:ascii="Cambria" w:hAnsi="Cambria"/>
                 <w:lang w:val="en-GB"/>
@@ -10739,11 +10785,13 @@
         </w:tc>
         <w:tc>
           <w:tcPr>
-            <w:tcW w:w="1969" w:type="dxa"/>
+            <w:tcW w:w="1764" w:type="dxa"/>
             <w:vMerge/>
           </w:tcPr>
           <w:p>
             <w:pPr>
+              <w:spacing w:line="240" w:lineRule="auto"/>
+              <w:jc w:val="center"/>
               <w:rPr>
                 <w:rFonts w:ascii="Cambria" w:hAnsi="Cambria"/>
                 <w:lang w:val="en-GB"/>
@@ -10753,33 +10801,28 @@
         </w:tc>
         <w:tc>
           <w:tcPr>
-            <w:tcW w:w="2218" w:type="dxa"/>
+            <w:tcW w:w="1981" w:type="dxa"/>
           </w:tcPr>
           <w:p>
             <w:pPr>
+              <w:spacing w:line="240" w:lineRule="auto"/>
+              <w:jc w:val="center"/>
               <w:rPr>
                 <w:rFonts w:ascii="Cambria" w:hAnsi="Cambria"/>
                 <w:lang w:val="en-GB"/>
               </w:rPr>
             </w:pPr>
+            <w:r>
+              <w:rPr>
+                <w:rFonts w:ascii="Cambria" w:hAnsi="Cambria"/>
+              </w:rPr>
+              <w:t>Pidev täiustamine ja organisatsiooni õppimisvõimekuse arendamine</w:t>
+            </w:r>
           </w:p>
         </w:tc>
         <w:tc>
           <w:tcPr>
-            <w:tcW w:w="1286" w:type="dxa"/>
-          </w:tcPr>
-          <w:p>
-            <w:pPr>
-              <w:rPr>
-                <w:rFonts w:ascii="Cambria" w:hAnsi="Cambria"/>
-                <w:lang w:val="en-GB"/>
-              </w:rPr>
-            </w:pPr>
-          </w:p>
-        </w:tc>
-        <w:tc>
-          <w:tcPr>
-            <w:tcW w:w="2082" w:type="dxa"/>
+            <w:tcW w:w="1922" w:type="dxa"/>
           </w:tcPr>
           <w:p>
             <w:pPr>
@@ -10787,6 +10830,7 @@
                 <w:tab w:val="clear" w:pos="6237"/>
               </w:tabs>
               <w:spacing w:line="240" w:lineRule="auto"/>
+              <w:jc w:val="center"/>
               <w:rPr>
                 <w:rFonts w:ascii="Cambria" w:hAnsi="Cambria"/>
               </w:rPr>
@@ -10800,6 +10844,8 @@
           </w:p>
           <w:p>
             <w:pPr>
+              <w:spacing w:line="240" w:lineRule="auto"/>
+              <w:jc w:val="center"/>
               <w:rPr>
                 <w:rFonts w:ascii="Cambria" w:hAnsi="Cambria"/>
                 <w:lang w:val="en-GB"/>
@@ -10809,76 +10855,12 @@
         </w:tc>
       </w:tr>
       <w:tr>
+        <w:trPr>
+          <w:jc w:val="center"/>
+        </w:trPr>
         <w:tc>
           <w:tcPr>
-            <w:tcW w:w="1223" w:type="dxa"/>
-          </w:tcPr>
-          <w:p>
-            <w:pPr>
-              <w:rPr>
-                <w:rFonts w:ascii="Cambria" w:hAnsi="Cambria"/>
-                <w:lang w:val="en-GB"/>
-              </w:rPr>
-            </w:pPr>
-          </w:p>
-        </w:tc>
-        <w:tc>
-          <w:tcPr>
-            <w:tcW w:w="1969" w:type="dxa"/>
-          </w:tcPr>
-          <w:p>
-            <w:pPr>
-              <w:rPr>
-                <w:rFonts w:ascii="Cambria" w:hAnsi="Cambria"/>
-                <w:lang w:val="en-GB"/>
-              </w:rPr>
-            </w:pPr>
-          </w:p>
-        </w:tc>
-        <w:tc>
-          <w:tcPr>
-            <w:tcW w:w="2218" w:type="dxa"/>
-          </w:tcPr>
-          <w:p>
-            <w:pPr>
-              <w:rPr>
-                <w:rFonts w:ascii="Cambria" w:hAnsi="Cambria"/>
-                <w:lang w:val="en-GB"/>
-              </w:rPr>
-            </w:pPr>
-          </w:p>
-        </w:tc>
-        <w:tc>
-          <w:tcPr>
-            <w:tcW w:w="1286" w:type="dxa"/>
-          </w:tcPr>
-          <w:p>
-            <w:pPr>
-              <w:rPr>
-                <w:rFonts w:ascii="Cambria" w:hAnsi="Cambria"/>
-                <w:lang w:val="en-GB"/>
-              </w:rPr>
-            </w:pPr>
-          </w:p>
-        </w:tc>
-        <w:tc>
-          <w:tcPr>
-            <w:tcW w:w="2082" w:type="dxa"/>
-          </w:tcPr>
-          <w:p>
-            <w:pPr>
-              <w:rPr>
-                <w:rFonts w:ascii="Cambria" w:hAnsi="Cambria"/>
-                <w:lang w:val="en-GB"/>
-              </w:rPr>
-            </w:pPr>
-          </w:p>
-        </w:tc>
-      </w:tr>
-      <w:tr>
-        <w:tc>
-          <w:tcPr>
-            <w:tcW w:w="1223" w:type="dxa"/>
+            <w:tcW w:w="1088" w:type="dxa"/>
             <w:vMerge w:val="restart"/>
           </w:tcPr>
           <w:p>
@@ -10887,6 +10869,7 @@
                 <w:tab w:val="clear" w:pos="6237"/>
               </w:tabs>
               <w:spacing w:line="240" w:lineRule="auto"/>
+              <w:jc w:val="center"/>
               <w:rPr>
                 <w:rFonts w:ascii="Cambria" w:hAnsi="Cambria"/>
               </w:rPr>
@@ -10901,6 +10884,8 @@
           </w:p>
           <w:p>
             <w:pPr>
+              <w:spacing w:line="240" w:lineRule="auto"/>
+              <w:jc w:val="center"/>
               <w:rPr>
                 <w:rFonts w:ascii="Cambria" w:hAnsi="Cambria"/>
                 <w:lang w:val="en-GB"/>
@@ -10910,7 +10895,7 @@
         </w:tc>
         <w:tc>
           <w:tcPr>
-            <w:tcW w:w="1969" w:type="dxa"/>
+            <w:tcW w:w="1764" w:type="dxa"/>
             <w:vMerge w:val="restart"/>
           </w:tcPr>
           <w:p>
@@ -10919,6 +10904,7 @@
                 <w:tab w:val="clear" w:pos="6237"/>
               </w:tabs>
               <w:spacing w:line="240" w:lineRule="auto"/>
+              <w:jc w:val="center"/>
               <w:rPr>
                 <w:rFonts w:ascii="Cambria" w:hAnsi="Cambria"/>
               </w:rPr>
@@ -10932,6 +10918,8 @@
           </w:p>
           <w:p>
             <w:pPr>
+              <w:spacing w:line="240" w:lineRule="auto"/>
+              <w:jc w:val="center"/>
               <w:rPr>
                 <w:rFonts w:ascii="Cambria" w:hAnsi="Cambria"/>
               </w:rPr>
@@ -10940,7 +10928,28 @@
         </w:tc>
         <w:tc>
           <w:tcPr>
-            <w:tcW w:w="2218" w:type="dxa"/>
+            <w:tcW w:w="1981" w:type="dxa"/>
+          </w:tcPr>
+          <w:p>
+            <w:pPr>
+              <w:spacing w:line="240" w:lineRule="auto"/>
+              <w:jc w:val="center"/>
+              <w:rPr>
+                <w:rFonts w:ascii="Cambria" w:hAnsi="Cambria"/>
+                <w:lang w:val="en-GB"/>
+              </w:rPr>
+            </w:pPr>
+            <w:r>
+              <w:rPr>
+                <w:rFonts w:ascii="Cambria" w:hAnsi="Cambria"/>
+              </w:rPr>
+              <w:t>Infoturberiskide tuvastamine ja maandamine</w:t>
+            </w:r>
+          </w:p>
+        </w:tc>
+        <w:tc>
+          <w:tcPr>
+            <w:tcW w:w="1922" w:type="dxa"/>
           </w:tcPr>
           <w:p>
             <w:pPr>
@@ -10948,19 +10957,34 @@
                 <w:tab w:val="clear" w:pos="6237"/>
               </w:tabs>
               <w:spacing w:line="240" w:lineRule="auto"/>
+              <w:jc w:val="center"/>
               <w:rPr>
                 <w:rFonts w:ascii="Cambria" w:hAnsi="Cambria"/>
+                <w:lang w:val="ru-RU"/>
               </w:rPr>
             </w:pPr>
             <w:r>
               <w:rPr>
                 <w:rFonts w:ascii="Cambria" w:hAnsi="Cambria"/>
               </w:rPr>
-              <w:t>Riskijuhtimine ja infoturbe meetmed.</w:t>
+              <w:t>IT-süsteemide turvalisuse parendamine.</w:t>
             </w:r>
           </w:p>
+        </w:tc>
+      </w:tr>
+      <w:tr>
+        <w:trPr>
+          <w:jc w:val="center"/>
+        </w:trPr>
+        <w:tc>
+          <w:tcPr>
+            <w:tcW w:w="1088" w:type="dxa"/>
+            <w:vMerge/>
+          </w:tcPr>
           <w:p>
             <w:pPr>
+              <w:spacing w:line="240" w:lineRule="auto"/>
+              <w:jc w:val="center"/>
               <w:rPr>
                 <w:rFonts w:ascii="Cambria" w:hAnsi="Cambria"/>
                 <w:lang w:val="en-GB"/>
@@ -10970,10 +10994,13 @@
         </w:tc>
         <w:tc>
           <w:tcPr>
-            <w:tcW w:w="1286" w:type="dxa"/>
+            <w:tcW w:w="1764" w:type="dxa"/>
+            <w:vMerge/>
           </w:tcPr>
           <w:p>
             <w:pPr>
+              <w:spacing w:line="240" w:lineRule="auto"/>
+              <w:jc w:val="center"/>
               <w:rPr>
                 <w:rFonts w:ascii="Cambria" w:hAnsi="Cambria"/>
                 <w:lang w:val="en-GB"/>
@@ -10983,50 +11010,28 @@
         </w:tc>
         <w:tc>
           <w:tcPr>
-            <w:tcW w:w="2082" w:type="dxa"/>
+            <w:tcW w:w="1981" w:type="dxa"/>
           </w:tcPr>
           <w:p>
             <w:pPr>
+              <w:spacing w:line="240" w:lineRule="auto"/>
+              <w:jc w:val="center"/>
               <w:rPr>
                 <w:rFonts w:ascii="Cambria" w:hAnsi="Cambria"/>
                 <w:lang w:val="en-GB"/>
               </w:rPr>
             </w:pPr>
-          </w:p>
-        </w:tc>
-      </w:tr>
-      <w:tr>
-        <w:tc>
-          <w:tcPr>
-            <w:tcW w:w="1223" w:type="dxa"/>
-            <w:vMerge/>
-          </w:tcPr>
-          <w:p>
-            <w:pPr>
+            <w:r>
               <w:rPr>
                 <w:rFonts w:ascii="Cambria" w:hAnsi="Cambria"/>
-                <w:lang w:val="en-GB"/>
-              </w:rPr>
-            </w:pPr>
+              </w:rPr>
+              <w:t>Juurdepääsukontroll ja andmete konfidentsiaalsuse tagamine</w:t>
+            </w:r>
           </w:p>
         </w:tc>
         <w:tc>
           <w:tcPr>
-            <w:tcW w:w="1969" w:type="dxa"/>
-            <w:vMerge/>
-          </w:tcPr>
-          <w:p>
-            <w:pPr>
-              <w:rPr>
-                <w:rFonts w:ascii="Cambria" w:hAnsi="Cambria"/>
-                <w:lang w:val="en-GB"/>
-              </w:rPr>
-            </w:pPr>
-          </w:p>
-        </w:tc>
-        <w:tc>
-          <w:tcPr>
-            <w:tcW w:w="2218" w:type="dxa"/>
+            <w:tcW w:w="1922" w:type="dxa"/>
           </w:tcPr>
           <w:p>
             <w:pPr>
@@ -11034,6 +11039,7 @@
                 <w:tab w:val="clear" w:pos="6237"/>
               </w:tabs>
               <w:spacing w:line="240" w:lineRule="auto"/>
+              <w:jc w:val="center"/>
               <w:rPr>
                 <w:rFonts w:ascii="Cambria" w:hAnsi="Cambria"/>
               </w:rPr>
@@ -11042,11 +11048,35 @@
               <w:rPr>
                 <w:rFonts w:ascii="Cambria" w:hAnsi="Cambria"/>
               </w:rPr>
-              <w:t>Juurdepääsukontroll ja tundlike andmete kaitse</w:t>
+              <w:t>Isikuandmete kaitse (GDPR).</w:t>
             </w:r>
           </w:p>
           <w:p>
             <w:pPr>
+              <w:spacing w:line="240" w:lineRule="auto"/>
+              <w:jc w:val="center"/>
+              <w:rPr>
+                <w:rFonts w:ascii="Cambria" w:hAnsi="Cambria"/>
+                <w:lang w:val="en-GB"/>
+              </w:rPr>
+            </w:pPr>
+          </w:p>
+        </w:tc>
+      </w:tr>
+      <w:tr>
+        <w:trPr>
+          <w:trHeight w:val="1407"/>
+          <w:jc w:val="center"/>
+        </w:trPr>
+        <w:tc>
+          <w:tcPr>
+            <w:tcW w:w="1088" w:type="dxa"/>
+            <w:vMerge/>
+          </w:tcPr>
+          <w:p>
+            <w:pPr>
+              <w:spacing w:line="240" w:lineRule="auto"/>
+              <w:jc w:val="center"/>
               <w:rPr>
                 <w:rFonts w:ascii="Cambria" w:hAnsi="Cambria"/>
                 <w:lang w:val="en-GB"/>
@@ -11056,10 +11086,13 @@
         </w:tc>
         <w:tc>
           <w:tcPr>
-            <w:tcW w:w="1286" w:type="dxa"/>
+            <w:tcW w:w="1764" w:type="dxa"/>
+            <w:vMerge/>
           </w:tcPr>
           <w:p>
             <w:pPr>
+              <w:spacing w:line="240" w:lineRule="auto"/>
+              <w:jc w:val="center"/>
               <w:rPr>
                 <w:rFonts w:ascii="Cambria" w:hAnsi="Cambria"/>
                 <w:lang w:val="en-GB"/>
@@ -11069,7 +11102,28 @@
         </w:tc>
         <w:tc>
           <w:tcPr>
-            <w:tcW w:w="2082" w:type="dxa"/>
+            <w:tcW w:w="1981" w:type="dxa"/>
+          </w:tcPr>
+          <w:p>
+            <w:pPr>
+              <w:spacing w:line="240" w:lineRule="auto"/>
+              <w:jc w:val="center"/>
+              <w:rPr>
+                <w:rFonts w:ascii="Cambria" w:hAnsi="Cambria"/>
+                <w:lang w:val="en-GB"/>
+              </w:rPr>
+            </w:pPr>
+            <w:r>
+              <w:rPr>
+                <w:rFonts w:ascii="Cambria" w:hAnsi="Cambria"/>
+              </w:rPr>
+              <w:t>Pidev turvameetmete jälgimine ja täiustamine</w:t>
+            </w:r>
+          </w:p>
+        </w:tc>
+        <w:tc>
+          <w:tcPr>
+            <w:tcW w:w="1922" w:type="dxa"/>
           </w:tcPr>
           <w:p>
             <w:pPr>
@@ -11077,6 +11131,7 @@
                 <w:tab w:val="clear" w:pos="6237"/>
               </w:tabs>
               <w:spacing w:line="240" w:lineRule="auto"/>
+              <w:jc w:val="center"/>
               <w:rPr>
                 <w:rFonts w:ascii="Cambria" w:hAnsi="Cambria"/>
               </w:rPr>
@@ -11085,11 +11140,13 @@
               <w:rPr>
                 <w:rFonts w:ascii="Cambria" w:hAnsi="Cambria"/>
               </w:rPr>
-              <w:t>Isikuandmete kaitse (GDPR).</w:t>
+              <w:t>Küberkaitse haridusasutustes.</w:t>
             </w:r>
           </w:p>
           <w:p>
             <w:pPr>
+              <w:spacing w:line="240" w:lineRule="auto"/>
+              <w:jc w:val="center"/>
               <w:rPr>
                 <w:rFonts w:ascii="Cambria" w:hAnsi="Cambria"/>
                 <w:lang w:val="en-GB"/>
@@ -11099,282 +11156,12 @@
         </w:tc>
       </w:tr>
       <w:tr>
+        <w:trPr>
+          <w:jc w:val="center"/>
+        </w:trPr>
         <w:tc>
           <w:tcPr>
-            <w:tcW w:w="1223" w:type="dxa"/>
-            <w:vMerge/>
-          </w:tcPr>
-          <w:p>
-            <w:pPr>
-              <w:rPr>
-                <w:rFonts w:ascii="Cambria" w:hAnsi="Cambria"/>
-                <w:lang w:val="en-GB"/>
-              </w:rPr>
-            </w:pPr>
-          </w:p>
-        </w:tc>
-        <w:tc>
-          <w:tcPr>
-            <w:tcW w:w="1969" w:type="dxa"/>
-            <w:vMerge/>
-          </w:tcPr>
-          <w:p>
-            <w:pPr>
-              <w:rPr>
-                <w:rFonts w:ascii="Cambria" w:hAnsi="Cambria"/>
-                <w:lang w:val="en-GB"/>
-              </w:rPr>
-            </w:pPr>
-          </w:p>
-        </w:tc>
-        <w:tc>
-          <w:tcPr>
-            <w:tcW w:w="2218" w:type="dxa"/>
-          </w:tcPr>
-          <w:p>
-            <w:pPr>
-              <w:tabs>
-                <w:tab w:val="clear" w:pos="6237"/>
-              </w:tabs>
-              <w:spacing w:line="240" w:lineRule="auto"/>
-              <w:rPr>
-                <w:rFonts w:ascii="Cambria" w:hAnsi="Cambria"/>
-              </w:rPr>
-            </w:pPr>
-            <w:r>
-              <w:rPr>
-                <w:rFonts w:ascii="Cambria" w:hAnsi="Cambria"/>
-              </w:rPr>
-              <w:t>Juurdepääsukontroll ja tundlike andmet</w:t>
-            </w:r>
-          </w:p>
-          <w:p>
-            <w:pPr>
-              <w:rPr>
-                <w:rFonts w:ascii="Cambria" w:hAnsi="Cambria"/>
-                <w:lang w:val="en-GB"/>
-              </w:rPr>
-            </w:pPr>
-          </w:p>
-        </w:tc>
-        <w:tc>
-          <w:tcPr>
-            <w:tcW w:w="1286" w:type="dxa"/>
-          </w:tcPr>
-          <w:p>
-            <w:pPr>
-              <w:rPr>
-                <w:rFonts w:ascii="Cambria" w:hAnsi="Cambria"/>
-                <w:lang w:val="en-GB"/>
-              </w:rPr>
-            </w:pPr>
-          </w:p>
-        </w:tc>
-        <w:tc>
-          <w:tcPr>
-            <w:tcW w:w="2082" w:type="dxa"/>
-          </w:tcPr>
-          <w:p>
-            <w:pPr>
-              <w:tabs>
-                <w:tab w:val="clear" w:pos="6237"/>
-              </w:tabs>
-              <w:spacing w:line="240" w:lineRule="auto"/>
-              <w:rPr>
-                <w:rFonts w:ascii="Cambria" w:hAnsi="Cambria"/>
-              </w:rPr>
-            </w:pPr>
-            <w:r>
-              <w:rPr>
-                <w:rFonts w:ascii="Cambria" w:hAnsi="Cambria"/>
-              </w:rPr>
-              <w:t>Küberkaitse haridusasutustes.</w:t>
-            </w:r>
-          </w:p>
-          <w:p>
-            <w:pPr>
-              <w:rPr>
-                <w:rFonts w:ascii="Cambria" w:hAnsi="Cambria"/>
-                <w:lang w:val="en-GB"/>
-              </w:rPr>
-            </w:pPr>
-          </w:p>
-        </w:tc>
-      </w:tr>
-      <w:tr>
-        <w:tc>
-          <w:tcPr>
-            <w:tcW w:w="1223" w:type="dxa"/>
-            <w:vMerge/>
-          </w:tcPr>
-          <w:p>
-            <w:pPr>
-              <w:rPr>
-                <w:rFonts w:ascii="Cambria" w:hAnsi="Cambria"/>
-                <w:lang w:val="en-GB"/>
-              </w:rPr>
-            </w:pPr>
-          </w:p>
-        </w:tc>
-        <w:tc>
-          <w:tcPr>
-            <w:tcW w:w="1969" w:type="dxa"/>
-            <w:vMerge/>
-          </w:tcPr>
-          <w:p>
-            <w:pPr>
-              <w:rPr>
-                <w:rFonts w:ascii="Cambria" w:hAnsi="Cambria"/>
-                <w:lang w:val="en-GB"/>
-              </w:rPr>
-            </w:pPr>
-          </w:p>
-        </w:tc>
-        <w:tc>
-          <w:tcPr>
-            <w:tcW w:w="2218" w:type="dxa"/>
-          </w:tcPr>
-          <w:p>
-            <w:pPr>
-              <w:tabs>
-                <w:tab w:val="clear" w:pos="6237"/>
-              </w:tabs>
-              <w:spacing w:line="240" w:lineRule="auto"/>
-              <w:rPr>
-                <w:rFonts w:ascii="Cambria" w:hAnsi="Cambria"/>
-              </w:rPr>
-            </w:pPr>
-            <w:r>
-              <w:rPr>
-                <w:rFonts w:ascii="Cambria" w:hAnsi="Cambria"/>
-              </w:rPr>
-              <w:t>Pidev turvaprotseduuride täiustamine.</w:t>
-            </w:r>
-          </w:p>
-          <w:p>
-            <w:pPr>
-              <w:rPr>
-                <w:rFonts w:ascii="Cambria" w:hAnsi="Cambria"/>
-                <w:lang w:val="en-GB"/>
-              </w:rPr>
-            </w:pPr>
-          </w:p>
-        </w:tc>
-        <w:tc>
-          <w:tcPr>
-            <w:tcW w:w="1286" w:type="dxa"/>
-          </w:tcPr>
-          <w:p>
-            <w:pPr>
-              <w:rPr>
-                <w:rFonts w:ascii="Cambria" w:hAnsi="Cambria"/>
-                <w:lang w:val="en-GB"/>
-              </w:rPr>
-            </w:pPr>
-          </w:p>
-        </w:tc>
-        <w:tc>
-          <w:tcPr>
-            <w:tcW w:w="2082" w:type="dxa"/>
-          </w:tcPr>
-          <w:p>
-            <w:pPr>
-              <w:tabs>
-                <w:tab w:val="clear" w:pos="6237"/>
-              </w:tabs>
-              <w:spacing w:line="240" w:lineRule="auto"/>
-              <w:rPr>
-                <w:rFonts w:ascii="Cambria" w:hAnsi="Cambria"/>
-              </w:rPr>
-            </w:pPr>
-            <w:r>
-              <w:rPr>
-                <w:rFonts w:ascii="Cambria" w:hAnsi="Cambria"/>
-              </w:rPr>
-              <w:t>IT-süsteemide turvalisuse parendamine.</w:t>
-            </w:r>
-          </w:p>
-          <w:p>
-            <w:pPr>
-              <w:rPr>
-                <w:rFonts w:ascii="Cambria" w:hAnsi="Cambria"/>
-                <w:lang w:val="ru-RU"/>
-              </w:rPr>
-            </w:pPr>
-          </w:p>
-        </w:tc>
-      </w:tr>
-      <w:tr>
-        <w:tc>
-          <w:tcPr>
-            <w:tcW w:w="1223" w:type="dxa"/>
-          </w:tcPr>
-          <w:p>
-            <w:pPr>
-              <w:rPr>
-                <w:rFonts w:ascii="Cambria" w:hAnsi="Cambria"/>
-                <w:lang w:val="en-GB"/>
-              </w:rPr>
-            </w:pPr>
-          </w:p>
-        </w:tc>
-        <w:tc>
-          <w:tcPr>
-            <w:tcW w:w="1969" w:type="dxa"/>
-          </w:tcPr>
-          <w:p>
-            <w:pPr>
-              <w:rPr>
-                <w:rFonts w:ascii="Cambria" w:hAnsi="Cambria"/>
-                <w:lang w:val="en-GB"/>
-              </w:rPr>
-            </w:pPr>
-          </w:p>
-        </w:tc>
-        <w:tc>
-          <w:tcPr>
-            <w:tcW w:w="2218" w:type="dxa"/>
-          </w:tcPr>
-          <w:p>
-            <w:pPr>
-              <w:rPr>
-                <w:rFonts w:ascii="Cambria" w:hAnsi="Cambria"/>
-                <w:lang w:val="en-GB"/>
-              </w:rPr>
-            </w:pPr>
-          </w:p>
-        </w:tc>
-        <w:tc>
-          <w:tcPr>
-            <w:tcW w:w="1286" w:type="dxa"/>
-          </w:tcPr>
-          <w:p>
-            <w:pPr>
-              <w:rPr>
-                <w:rFonts w:ascii="Cambria" w:hAnsi="Cambria"/>
-                <w:lang w:val="en-GB"/>
-              </w:rPr>
-            </w:pPr>
-          </w:p>
-        </w:tc>
-        <w:tc>
-          <w:tcPr>
-            <w:tcW w:w="2082" w:type="dxa"/>
-          </w:tcPr>
-          <w:p>
-            <w:pPr>
-              <w:rPr>
-                <w:rFonts w:ascii="Cambria" w:hAnsi="Cambria"/>
-                <w:lang w:val="en-GB"/>
-              </w:rPr>
-            </w:pPr>
-          </w:p>
-        </w:tc>
-      </w:tr>
-      <w:tr>
-        <w:tc>
-          <w:tcPr>
-            <w:tcW w:w="1223" w:type="dxa"/>
+            <w:tcW w:w="1088" w:type="dxa"/>
             <w:vMerge w:val="restart"/>
           </w:tcPr>
           <w:p>
@@ -11383,6 +11170,7 @@
                 <w:tab w:val="clear" w:pos="6237"/>
               </w:tabs>
               <w:spacing w:line="240" w:lineRule="auto"/>
+              <w:jc w:val="center"/>
               <w:rPr>
                 <w:rFonts w:ascii="Cambria" w:hAnsi="Cambria"/>
               </w:rPr>
@@ -11397,6 +11185,8 @@
           </w:p>
           <w:p>
             <w:pPr>
+              <w:spacing w:line="240" w:lineRule="auto"/>
+              <w:jc w:val="center"/>
               <w:rPr>
                 <w:rFonts w:ascii="Cambria" w:hAnsi="Cambria"/>
                 <w:lang w:val="en-GB"/>
@@ -11406,7 +11196,7 @@
         </w:tc>
         <w:tc>
           <w:tcPr>
-            <w:tcW w:w="1969" w:type="dxa"/>
+            <w:tcW w:w="1764" w:type="dxa"/>
             <w:vMerge w:val="restart"/>
           </w:tcPr>
           <w:p>
@@ -11415,6 +11205,7 @@
                 <w:tab w:val="clear" w:pos="6237"/>
               </w:tabs>
               <w:spacing w:line="240" w:lineRule="auto"/>
+              <w:jc w:val="center"/>
               <w:rPr>
                 <w:rFonts w:ascii="Cambria" w:hAnsi="Cambria"/>
               </w:rPr>
@@ -11428,6 +11219,8 @@
           </w:p>
           <w:p>
             <w:pPr>
+              <w:spacing w:line="240" w:lineRule="auto"/>
+              <w:jc w:val="center"/>
               <w:rPr>
                 <w:rFonts w:ascii="Cambria" w:hAnsi="Cambria"/>
               </w:rPr>
@@ -11436,7 +11229,28 @@
         </w:tc>
         <w:tc>
           <w:tcPr>
-            <w:tcW w:w="2218" w:type="dxa"/>
+            <w:tcW w:w="1981" w:type="dxa"/>
+          </w:tcPr>
+          <w:p>
+            <w:pPr>
+              <w:spacing w:line="240" w:lineRule="auto"/>
+              <w:jc w:val="center"/>
+              <w:rPr>
+                <w:rFonts w:ascii="Cambria" w:hAnsi="Cambria"/>
+                <w:lang w:val="en-GB"/>
+              </w:rPr>
+            </w:pPr>
+            <w:r>
+              <w:rPr>
+                <w:rFonts w:ascii="Cambria" w:hAnsi="Cambria"/>
+              </w:rPr>
+              <w:t>Teadmiste loomise, säilitamise ja jagamise süsteemne haldamine</w:t>
+            </w:r>
+          </w:p>
+        </w:tc>
+        <w:tc>
+          <w:tcPr>
+            <w:tcW w:w="1922" w:type="dxa"/>
           </w:tcPr>
           <w:p>
             <w:pPr>
@@ -11444,6 +11258,7 @@
                 <w:tab w:val="clear" w:pos="6237"/>
               </w:tabs>
               <w:spacing w:line="240" w:lineRule="auto"/>
+              <w:jc w:val="center"/>
               <w:rPr>
                 <w:rFonts w:ascii="Cambria" w:hAnsi="Cambria"/>
               </w:rPr>
@@ -11452,11 +11267,34 @@
               <w:rPr>
                 <w:rFonts w:ascii="Cambria" w:hAnsi="Cambria"/>
               </w:rPr>
-              <w:t>Süsteemne teadmiste haldamine.</w:t>
+              <w:t>Akadeemiliste teadmiste haldamine.</w:t>
             </w:r>
           </w:p>
           <w:p>
             <w:pPr>
+              <w:spacing w:line="240" w:lineRule="auto"/>
+              <w:jc w:val="center"/>
+              <w:rPr>
+                <w:rFonts w:ascii="Cambria" w:hAnsi="Cambria"/>
+                <w:lang w:val="en-GB"/>
+              </w:rPr>
+            </w:pPr>
+          </w:p>
+        </w:tc>
+      </w:tr>
+      <w:tr>
+        <w:trPr>
+          <w:jc w:val="center"/>
+        </w:trPr>
+        <w:tc>
+          <w:tcPr>
+            <w:tcW w:w="1088" w:type="dxa"/>
+            <w:vMerge/>
+          </w:tcPr>
+          <w:p>
+            <w:pPr>
+              <w:spacing w:line="240" w:lineRule="auto"/>
+              <w:jc w:val="center"/>
               <w:rPr>
                 <w:rFonts w:ascii="Cambria" w:hAnsi="Cambria"/>
                 <w:lang w:val="en-GB"/>
@@ -11466,10 +11304,13 @@
         </w:tc>
         <w:tc>
           <w:tcPr>
-            <w:tcW w:w="1286" w:type="dxa"/>
+            <w:tcW w:w="1764" w:type="dxa"/>
+            <w:vMerge/>
           </w:tcPr>
           <w:p>
             <w:pPr>
+              <w:spacing w:line="240" w:lineRule="auto"/>
+              <w:jc w:val="center"/>
               <w:rPr>
                 <w:rFonts w:ascii="Cambria" w:hAnsi="Cambria"/>
                 <w:lang w:val="en-GB"/>
@@ -11479,7 +11320,28 @@
         </w:tc>
         <w:tc>
           <w:tcPr>
-            <w:tcW w:w="2082" w:type="dxa"/>
+            <w:tcW w:w="1981" w:type="dxa"/>
+          </w:tcPr>
+          <w:p>
+            <w:pPr>
+              <w:spacing w:line="240" w:lineRule="auto"/>
+              <w:jc w:val="center"/>
+              <w:rPr>
+                <w:rFonts w:ascii="Cambria" w:hAnsi="Cambria"/>
+                <w:lang w:val="en-GB"/>
+              </w:rPr>
+            </w:pPr>
+            <w:r>
+              <w:rPr>
+                <w:rFonts w:ascii="Cambria" w:hAnsi="Cambria"/>
+              </w:rPr>
+              <w:t>Teadmiste kvaliteedi ja usaldusväärsuse tagamine</w:t>
+            </w:r>
+          </w:p>
+        </w:tc>
+        <w:tc>
+          <w:tcPr>
+            <w:tcW w:w="1922" w:type="dxa"/>
           </w:tcPr>
           <w:p>
             <w:pPr>
@@ -11487,6 +11349,7 @@
                 <w:tab w:val="clear" w:pos="6237"/>
               </w:tabs>
               <w:spacing w:line="240" w:lineRule="auto"/>
+              <w:jc w:val="center"/>
               <w:rPr>
                 <w:rFonts w:ascii="Cambria" w:hAnsi="Cambria"/>
               </w:rPr>
@@ -11495,27 +11358,33 @@
               <w:rPr>
                 <w:rFonts w:ascii="Cambria" w:hAnsi="Cambria"/>
               </w:rPr>
-              <w:t>Akadeemiliste teadmiste haldamine.</w:t>
+              <w:t>Õppe- ja teadusasutuste sisemiste teadmiste jagamine</w:t>
             </w:r>
           </w:p>
           <w:p>
             <w:pPr>
+              <w:spacing w:line="240" w:lineRule="auto"/>
+              <w:jc w:val="center"/>
               <w:rPr>
                 <w:rFonts w:ascii="Cambria" w:hAnsi="Cambria"/>
-                <w:lang w:val="en-GB"/>
               </w:rPr>
             </w:pPr>
           </w:p>
         </w:tc>
       </w:tr>
       <w:tr>
+        <w:trPr>
+          <w:jc w:val="center"/>
+        </w:trPr>
         <w:tc>
           <w:tcPr>
-            <w:tcW w:w="1223" w:type="dxa"/>
+            <w:tcW w:w="1088" w:type="dxa"/>
             <w:vMerge/>
           </w:tcPr>
           <w:p>
             <w:pPr>
+              <w:spacing w:line="240" w:lineRule="auto"/>
+              <w:jc w:val="center"/>
               <w:rPr>
                 <w:rFonts w:ascii="Cambria" w:hAnsi="Cambria"/>
                 <w:lang w:val="en-GB"/>
@@ -11525,11 +11394,13 @@
         </w:tc>
         <w:tc>
           <w:tcPr>
-            <w:tcW w:w="1969" w:type="dxa"/>
+            <w:tcW w:w="1764" w:type="dxa"/>
             <w:vMerge/>
           </w:tcPr>
           <w:p>
             <w:pPr>
+              <w:spacing w:line="240" w:lineRule="auto"/>
+              <w:jc w:val="center"/>
               <w:rPr>
                 <w:rFonts w:ascii="Cambria" w:hAnsi="Cambria"/>
                 <w:lang w:val="en-GB"/>
@@ -11539,7 +11410,28 @@
         </w:tc>
         <w:tc>
           <w:tcPr>
-            <w:tcW w:w="2218" w:type="dxa"/>
+            <w:tcW w:w="1981" w:type="dxa"/>
+          </w:tcPr>
+          <w:p>
+            <w:pPr>
+              <w:spacing w:line="240" w:lineRule="auto"/>
+              <w:jc w:val="center"/>
+              <w:rPr>
+                <w:rFonts w:ascii="Cambria" w:hAnsi="Cambria"/>
+                <w:lang w:val="en-GB"/>
+              </w:rPr>
+            </w:pPr>
+            <w:r>
+              <w:rPr>
+                <w:rFonts w:ascii="Cambria" w:hAnsi="Cambria"/>
+              </w:rPr>
+              <w:t>Pidev täiustamine ja teadmiste kättesaadavuse suurendamine</w:t>
+            </w:r>
+          </w:p>
+        </w:tc>
+        <w:tc>
+          <w:tcPr>
+            <w:tcW w:w="1922" w:type="dxa"/>
           </w:tcPr>
           <w:p>
             <w:pPr>
@@ -11547,6 +11439,7 @@
                 <w:tab w:val="clear" w:pos="6237"/>
               </w:tabs>
               <w:spacing w:line="240" w:lineRule="auto"/>
+              <w:jc w:val="center"/>
               <w:rPr>
                 <w:rFonts w:ascii="Cambria" w:hAnsi="Cambria"/>
               </w:rPr>
@@ -11555,148 +11448,13 @@
               <w:rPr>
                 <w:rFonts w:ascii="Cambria" w:hAnsi="Cambria"/>
               </w:rPr>
-              <w:t>Organisatsioonilise õppe ja innovatsiooni toetamine.</w:t>
+              <w:t>Digitaalsete teadmistebaaside ja AI lahenduste rakendamine.</w:t>
             </w:r>
           </w:p>
           <w:p>
             <w:pPr>
-              <w:rPr>
-                <w:rFonts w:ascii="Cambria" w:hAnsi="Cambria"/>
-              </w:rPr>
-            </w:pPr>
-          </w:p>
-        </w:tc>
-        <w:tc>
-          <w:tcPr>
-            <w:tcW w:w="1286" w:type="dxa"/>
-          </w:tcPr>
-          <w:p>
-            <w:pPr>
-              <w:rPr>
-                <w:rFonts w:ascii="Cambria" w:hAnsi="Cambria"/>
-                <w:lang w:val="en-GB"/>
-              </w:rPr>
-            </w:pPr>
-          </w:p>
-        </w:tc>
-        <w:tc>
-          <w:tcPr>
-            <w:tcW w:w="2082" w:type="dxa"/>
-          </w:tcPr>
-          <w:p>
-            <w:pPr>
-              <w:tabs>
-                <w:tab w:val="clear" w:pos="6237"/>
-              </w:tabs>
               <w:spacing w:line="240" w:lineRule="auto"/>
-              <w:rPr>
-                <w:rFonts w:ascii="Cambria" w:hAnsi="Cambria"/>
-              </w:rPr>
-            </w:pPr>
-            <w:r>
-              <w:rPr>
-                <w:rFonts w:ascii="Cambria" w:hAnsi="Cambria"/>
-              </w:rPr>
-              <w:t>Õppe- ja teadusasutuste sisemiste teadmiste jagamine</w:t>
-            </w:r>
-          </w:p>
-          <w:p>
-            <w:pPr>
-              <w:rPr>
-                <w:rFonts w:ascii="Cambria" w:hAnsi="Cambria"/>
-              </w:rPr>
-            </w:pPr>
-          </w:p>
-        </w:tc>
-      </w:tr>
-      <w:tr>
-        <w:tc>
-          <w:tcPr>
-            <w:tcW w:w="1223" w:type="dxa"/>
-            <w:vMerge/>
-          </w:tcPr>
-          <w:p>
-            <w:pPr>
-              <w:rPr>
-                <w:rFonts w:ascii="Cambria" w:hAnsi="Cambria"/>
-                <w:lang w:val="en-GB"/>
-              </w:rPr>
-            </w:pPr>
-          </w:p>
-        </w:tc>
-        <w:tc>
-          <w:tcPr>
-            <w:tcW w:w="1969" w:type="dxa"/>
-            <w:vMerge/>
-          </w:tcPr>
-          <w:p>
-            <w:pPr>
-              <w:rPr>
-                <w:rFonts w:ascii="Cambria" w:hAnsi="Cambria"/>
-                <w:lang w:val="en-GB"/>
-              </w:rPr>
-            </w:pPr>
-          </w:p>
-        </w:tc>
-        <w:tc>
-          <w:tcPr>
-            <w:tcW w:w="2218" w:type="dxa"/>
-          </w:tcPr>
-          <w:p>
-            <w:pPr>
-              <w:tabs>
-                <w:tab w:val="clear" w:pos="6237"/>
-              </w:tabs>
-              <w:spacing w:line="240" w:lineRule="auto"/>
-              <w:rPr>
-                <w:rFonts w:ascii="Cambria" w:hAnsi="Cambria"/>
-                <w:lang w:val="ru-RU"/>
-              </w:rPr>
-            </w:pPr>
-            <w:r>
-              <w:rPr>
-                <w:rFonts w:ascii="Cambria" w:hAnsi="Cambria"/>
-              </w:rPr>
-              <w:t>Teadmiste ja kogemuste jagamine.</w:t>
-            </w:r>
-          </w:p>
-        </w:tc>
-        <w:tc>
-          <w:tcPr>
-            <w:tcW w:w="1286" w:type="dxa"/>
-          </w:tcPr>
-          <w:p>
-            <w:pPr>
-              <w:rPr>
-                <w:rFonts w:ascii="Cambria" w:hAnsi="Cambria"/>
-                <w:lang w:val="en-GB"/>
-              </w:rPr>
-            </w:pPr>
-          </w:p>
-        </w:tc>
-        <w:tc>
-          <w:tcPr>
-            <w:tcW w:w="2082" w:type="dxa"/>
-          </w:tcPr>
-          <w:p>
-            <w:pPr>
-              <w:tabs>
-                <w:tab w:val="clear" w:pos="6237"/>
-              </w:tabs>
-              <w:spacing w:line="240" w:lineRule="auto"/>
-              <w:rPr>
-                <w:rFonts w:ascii="Cambria" w:hAnsi="Cambria"/>
-              </w:rPr>
-            </w:pPr>
-            <w:r>
-              <w:rPr>
-                <w:rFonts w:ascii="Cambria" w:hAnsi="Cambria"/>
-              </w:rPr>
-              <w:t>Digitaalsete teadmistebaaside ja AI lahenduste rakendamine.</w:t>
-            </w:r>
-          </w:p>
-          <w:p>
-            <w:pPr>
+              <w:jc w:val="center"/>
               <w:rPr>
                 <w:rFonts w:ascii="Cambria" w:hAnsi="Cambria"/>
               </w:rPr>
@@ -11707,6 +11465,101 @@
     </w:tbl>
     <w:p>
       <w:pPr>
+        <w:pStyle w:val="Heading3"/>
+        <w:numPr>
+          <w:ilvl w:val="0"/>
+          <w:numId w:val="0"/>
+        </w:numPr>
+        <w:ind w:left="720" w:hanging="720"/>
+        <w:rPr>
+          <w:rStyle w:val="Strong"/>
+          <w:b/>
+          <w:bCs w:val="0"/>
+        </w:rPr>
+      </w:pPr>
+    </w:p>
+    <w:p>
+      <w:pPr>
+        <w:pStyle w:val="Heading3"/>
+      </w:pPr>
+      <w:r>
+        <w:rPr>
+          <w:rStyle w:val="Strong"/>
+          <w:b/>
+          <w:bCs w:val="0"/>
+        </w:rPr>
+        <w:t>Ühine lähenemine ja seosed</w:t>
+      </w:r>
+    </w:p>
+    <w:p>
+      <w:pPr>
+        <w:pStyle w:val="NormalWeb"/>
+        <w:spacing w:line="240" w:lineRule="auto"/>
+      </w:pPr>
+      <w:r>
+        <w:t xml:space="preserve">Kõik kolm standardit jagavad </w:t>
+      </w:r>
+      <w:r>
+        <w:rPr>
+          <w:rStyle w:val="Strong"/>
+        </w:rPr>
+        <w:t>ühiseid põhimõtteid</w:t>
+      </w:r>
+      <w:r>
+        <w:t xml:space="preserve">, näiteks </w:t>
+      </w:r>
+      <w:r>
+        <w:rPr>
+          <w:rStyle w:val="Strong"/>
+        </w:rPr>
+        <w:t>protsesside süstemaatiline täiustamine, riskihindamine, sidusrühmade kaasamine ja teadmiste haldamine</w:t>
+      </w:r>
+      <w:r>
+        <w:t xml:space="preserve">. See </w:t>
+      </w:r>
+      <w:r>
+        <w:lastRenderedPageBreak/>
+        <w:t xml:space="preserve">näitab, et haridusasutuste digitaliseerimine ja automatiseerimine peab olema </w:t>
+      </w:r>
+      <w:r>
+        <w:rPr>
+          <w:rStyle w:val="Strong"/>
+        </w:rPr>
+        <w:t>terviklik protsess</w:t>
+      </w:r>
+      <w:r>
+        <w:t xml:space="preserve">, mis ei keskendu ainult tehnilistele lahendustele, vaid hõlmab ka </w:t>
+      </w:r>
+      <w:r>
+        <w:rPr>
+          <w:rStyle w:val="Strong"/>
+        </w:rPr>
+        <w:t>juhtimise, infoturbe ja teadmiste jagamise</w:t>
+      </w:r>
+      <w:r>
+        <w:t xml:space="preserve"> süsteeme.</w:t>
+      </w:r>
+    </w:p>
+    <w:p>
+      <w:pPr>
+        <w:pStyle w:val="NormalWeb"/>
+        <w:spacing w:line="240" w:lineRule="auto"/>
+      </w:pPr>
+      <w:r>
+        <w:t xml:space="preserve">Haridusasutused saavad </w:t>
+      </w:r>
+      <w:r>
+        <w:rPr>
+          <w:rStyle w:val="Strong"/>
+        </w:rPr>
+        <w:t>kombineerides neid standardeid</w:t>
+      </w:r>
+      <w:r>
+        <w:t xml:space="preserve"> luua tõhusa ja jätkusuutliku automatiseeritud juhtimissüsteemi, mis aitab paremini vastata tänapäeva haridusvaldkonna väljakutsetele.</w:t>
+      </w:r>
+    </w:p>
+    <w:p>
+      <w:pPr>
         <w:rPr>
           <w:rFonts w:ascii="Cambria" w:hAnsi="Cambria"/>
           <w:lang w:val="en-GB"/>
@@ -11716,12 +11569,26 @@
     <w:p>
       <w:pPr>
         <w:pStyle w:val="Heading2"/>
+        <w:numPr>
+          <w:ilvl w:val="0"/>
+          <w:numId w:val="0"/>
+        </w:numPr>
+        <w:ind w:left="576"/>
         <w:rPr>
           <w:rFonts w:ascii="Cambria" w:hAnsi="Cambria"/>
           <w:lang w:val="ru-RU"/>
         </w:rPr>
       </w:pPr>
       <w:bookmarkStart w:id="18" w:name="_Toc190518915"/>
+    </w:p>
+    <w:p>
+      <w:pPr>
+        <w:pStyle w:val="Heading2"/>
+        <w:rPr>
+          <w:rFonts w:ascii="Cambria" w:hAnsi="Cambria"/>
+          <w:lang w:val="ru-RU"/>
+        </w:rPr>
+      </w:pPr>
       <w:r>
         <w:rPr>
           <w:rFonts w:ascii="Cambria" w:hAnsi="Cambria"/>
@@ -11762,7 +11629,6 @@
           <w:rFonts w:ascii="Cambria" w:hAnsi="Cambria"/>
           <w:lang w:val="en-GB"/>
         </w:rPr>
-        <w:lastRenderedPageBreak/>
         <w:t>Digitaalsete tehnoloogiate kiire areng on suurendanud vajadust haridusasutuste protsesside automatiseerimise järele, pakkudes võimalusi parandada õppeprotsesside tõhusust ja töökorralduse kvaliteeti. Kuid see areng ei toimu ilma väljakutseteta. Pappa, Georgiou ja Pittich (2024) rõhutavad, et tehnoloogia rakendamine hariduses ei ole pelgalt uute süsteemide juurutamine, vaid nõuab ka olemasolevate protsesside ja struktuuride põhjalikku analüüsimist ja kohandamist. Uuringute tulemused näitavad, et õige tehnoloogiline integratsioon parandab oluliselt õppeprotsesside efektiivsust ja vähendab administraatiivset koormust (Pappa et al., 2024).</w:t>
       </w:r>
     </w:p>
@@ -11878,6 +11744,7 @@
           <w:rFonts w:ascii="Cambria" w:hAnsi="Cambria"/>
           <w:lang w:val="en-GB"/>
         </w:rPr>
+        <w:lastRenderedPageBreak/>
         <w:t xml:space="preserve">Ta </w:t>
       </w:r>
       <w:r>
@@ -12083,15 +11950,7 @@
           <w:rFonts w:ascii="Cambria" w:hAnsi="Cambria"/>
           <w:lang w:val="en-GB"/>
         </w:rPr>
-        <w:t xml:space="preserve">Teadmiste haldamine haridusasutustes on seotud väljakutsetega, mis tulenevad kriitilise teabe </w:t>
-      </w:r>
-      <w:r>
-        <w:rPr>
-          <w:rFonts w:ascii="Cambria" w:hAnsi="Cambria"/>
-          <w:lang w:val="en-GB"/>
-        </w:rPr>
-        <w:lastRenderedPageBreak/>
-        <w:t>kadumisest töötajate vahetumisel ja teadmiste hajutatusest erinevates osakondades. Efektiivne teadmiste haldamine vähendab selliseid riske ja parandab otsuste tegemise protsesse.</w:t>
+        <w:t>Teadmiste haldamine haridusasutustes on seotud väljakutsetega, mis tulenevad kriitilise teabe kadumisest töötajate vahetumisel ja teadmiste hajutatusest erinevates osakondades. Efektiivne teadmiste haldamine vähendab selliseid riske ja parandab otsuste tegemise protsesse.</w:t>
       </w:r>
     </w:p>
     <w:p>
@@ -12226,7 +12085,15 @@
           <w:rFonts w:ascii="Cambria" w:hAnsi="Cambria"/>
           <w:lang w:val="en-GB" w:bidi="en-US"/>
         </w:rPr>
-        <w:t>Uuringud näitavad, et infosüsteemide ühilduvusprobleemid võivad tekitada olulisi tõkkeid automatiseerimise tõhusale rakendamisele (Gkrimpizi &amp; Peristeras, 2022). Sageli puuduvad haridusasutustel vajalikud protokollid ja standardid, mis võimaldaksid erinevate süsteemide sujuvat integreerimist. See toob kaasa olukorra, kus andmeid tuleb süsteemide vahel manuaalselt üle kanda, mis suurendab vigade tekkimise ohtu ja vähendab tõhusust.</w:t>
+        <w:t xml:space="preserve">Uuringud näitavad, et infosüsteemide ühilduvusprobleemid võivad tekitada olulisi tõkkeid automatiseerimise tõhusale rakendamisele (Gkrimpizi &amp; Peristeras, 2022). Sageli puuduvad </w:t>
+      </w:r>
+      <w:r>
+        <w:rPr>
+          <w:rFonts w:ascii="Cambria" w:hAnsi="Cambria"/>
+          <w:lang w:val="en-GB" w:bidi="en-US"/>
+        </w:rPr>
+        <w:lastRenderedPageBreak/>
+        <w:t>haridusasutustel vajalikud protokollid ja standardid, mis võimaldaksid erinevate süsteemide sujuvat integreerimist. See toob kaasa olukorra, kus andmeid tuleb süsteemide vahel manuaalselt üle kanda, mis suurendab vigade tekkimise ohtu ja vähendab tõhusust.</w:t>
       </w:r>
     </w:p>
     <w:p>
@@ -12276,15 +12143,7 @@
           <w:rFonts w:ascii="Cambria" w:hAnsi="Cambria"/>
           <w:lang w:val="en-GB" w:bidi="en-US"/>
         </w:rPr>
-        <w:t xml:space="preserve">Kunstlik intelligents (AI) ja masinõpe (ML) pakuvad uusi võimalusi haridusasutuste protsesside automatiseerimiseks ja õppimise personaliseerimiseks. Olaf Zawacki-Richter, Victoria I. Marín, Melissa </w:t>
-      </w:r>
-      <w:r>
-        <w:rPr>
-          <w:rFonts w:ascii="Cambria" w:hAnsi="Cambria"/>
-          <w:lang w:val="en-GB" w:bidi="en-US"/>
-        </w:rPr>
-        <w:lastRenderedPageBreak/>
-        <w:t>Bond ja Franziska Gouverneur (2019) rõhutavad oma süsteemses ülevaates, et AI-lahenduste rakendamine võib oluliselt parandada õpitulemusi, tõhustada õppeprotsesse ja pakkuda personaliseeritud õpikogemusi.</w:t>
+        <w:t>Kunstlik intelligents (AI) ja masinõpe (ML) pakuvad uusi võimalusi haridusasutuste protsesside automatiseerimiseks ja õppimise personaliseerimiseks. Olaf Zawacki-Richter, Victoria I. Marín, Melissa Bond ja Franziska Gouverneur (2019) rõhutavad oma süsteemses ülevaates, et AI-lahenduste rakendamine võib oluliselt parandada õpitulemusi, tõhustada õppeprotsesse ja pakkuda personaliseeritud õpikogemusi.</w:t>
       </w:r>
     </w:p>
     <w:p>
@@ -15736,25 +15595,7 @@
             <w:szCs w:val="22"/>
             <w:lang w:val="en-GB" w:bidi="ar-SA"/>
           </w:rPr>
-          <w:t>htt</w:t>
-        </w:r>
-        <w:r>
-          <w:rPr>
-            <w:rStyle w:val="Hyperlink"/>
-            <w:rFonts w:ascii="Cambria" w:eastAsiaTheme="minorHAnsi" w:hAnsi="Cambria" w:cstheme="minorBidi"/>
-            <w:szCs w:val="22"/>
-            <w:lang w:val="en-GB" w:bidi="ar-SA"/>
-          </w:rPr>
-          <w:t>p</w:t>
-        </w:r>
-        <w:r>
-          <w:rPr>
-            <w:rStyle w:val="Hyperlink"/>
-            <w:rFonts w:ascii="Cambria" w:eastAsiaTheme="minorHAnsi" w:hAnsi="Cambria" w:cstheme="minorBidi"/>
-            <w:szCs w:val="22"/>
-            <w:lang w:val="en-GB" w:bidi="ar-SA"/>
-          </w:rPr>
-          <w:t>s://doi.org/10.1007/s42438-021-00263-3</w:t>
+          <w:t>https://doi.org/10.1007/s42438-021-00263-3</w:t>
         </w:r>
       </w:hyperlink>
     </w:p>
@@ -16164,25 +16005,7 @@
             <w:szCs w:val="22"/>
             <w:lang w:val="en-GB" w:bidi="ar-SA"/>
           </w:rPr>
-          <w:t>https://doi.org/10.1186/s41239-019-017</w:t>
-        </w:r>
-        <w:r>
-          <w:rPr>
-            <w:rStyle w:val="Hyperlink"/>
-            <w:rFonts w:ascii="Cambria" w:eastAsiaTheme="minorHAnsi" w:hAnsi="Cambria" w:cstheme="minorBidi"/>
-            <w:szCs w:val="22"/>
-            <w:lang w:val="en-GB" w:bidi="ar-SA"/>
-          </w:rPr>
-          <w:t>1</w:t>
-        </w:r>
-        <w:r>
-          <w:rPr>
-            <w:rStyle w:val="Hyperlink"/>
-            <w:rFonts w:ascii="Cambria" w:eastAsiaTheme="minorHAnsi" w:hAnsi="Cambria" w:cstheme="minorBidi"/>
-            <w:szCs w:val="22"/>
-            <w:lang w:val="en-GB" w:bidi="ar-SA"/>
-          </w:rPr>
-          <w:t>-0</w:t>
+          <w:t>https://doi.org/10.1186/s41239-019-0171-0</w:t>
         </w:r>
       </w:hyperlink>
     </w:p>
@@ -25396,6 +25219,12 @@
 </file>
 
 <file path=customXml/item1.xml><?xml version="1.0" encoding="utf-8"?>
+<p:properties xmlns:p="http://schemas.microsoft.com/office/2006/metadata/properties" xmlns:xsi="http://www.w3.org/2001/XMLSchema-instance" xmlns:pc="http://schemas.microsoft.com/office/infopath/2007/PartnerControls">
+  <documentManagement/>
+</p:properties>
+</file>
+
+<file path=customXml/item2.xml><?xml version="1.0" encoding="utf-8"?>
 <?mso-contentType ?>
 <FormTemplates xmlns="http://schemas.microsoft.com/sharepoint/v3/contenttype/forms">
   <Display>DocumentLibraryForm</Display>
@@ -25404,17 +25233,7 @@
 </FormTemplates>
 </file>
 
-<file path=customXml/item2.xml><?xml version="1.0" encoding="utf-8"?>
-<p:properties xmlns:p="http://schemas.microsoft.com/office/2006/metadata/properties" xmlns:xsi="http://www.w3.org/2001/XMLSchema-instance" xmlns:pc="http://schemas.microsoft.com/office/infopath/2007/PartnerControls">
-  <documentManagement/>
-</p:properties>
-</file>
-
 <file path=customXml/item3.xml><?xml version="1.0" encoding="utf-8"?>
-<b:Sources xmlns:b="http://schemas.openxmlformats.org/officeDocument/2006/bibliography" xmlns="http://schemas.openxmlformats.org/officeDocument/2006/bibliography" SelectedStyle="\APASixthEditionOfficeOnline.xsl" StyleName="APA" Version="6"/>
-</file>
-
-<file path=customXml/item4.xml><?xml version="1.0" encoding="utf-8"?>
 <ct:contentTypeSchema xmlns:ct="http://schemas.microsoft.com/office/2006/metadata/contentType" xmlns:ma="http://schemas.microsoft.com/office/2006/metadata/properties/metaAttributes" ct:_="" ma:_="" ma:contentTypeName="Document" ma:contentTypeID="0x010100639121128003264B8A080B9AE63BAFE5" ma:contentTypeVersion="8" ma:contentTypeDescription="Create a new document." ma:contentTypeScope="" ma:versionID="f0e4ce22ad6c99f06436252d1b6ffc49">
   <xsd:schema xmlns:xsd="http://www.w3.org/2001/XMLSchema" xmlns:xs="http://www.w3.org/2001/XMLSchema" xmlns:p="http://schemas.microsoft.com/office/2006/metadata/properties" xmlns:ns2="47357ab7-33f4-40a6-9824-a57a0b31203f" targetNamespace="http://schemas.microsoft.com/office/2006/metadata/properties" ma:root="true" ma:fieldsID="4604646dc8e30b8ea802f474195fefc2" ns2:_="">
     <xsd:import namespace="47357ab7-33f4-40a6-9824-a57a0b31203f"/>
@@ -25582,15 +25401,11 @@
 </ct:contentTypeSchema>
 </file>
 
-<file path=customXml/itemProps1.xml><?xml version="1.0" encoding="utf-8"?>
-<ds:datastoreItem xmlns:ds="http://schemas.openxmlformats.org/officeDocument/2006/customXml" ds:itemID="{75D03931-F062-4262-AB08-608FD6DEBE13}">
-  <ds:schemaRefs>
-    <ds:schemaRef ds:uri="http://schemas.microsoft.com/sharepoint/v3/contenttype/forms"/>
-  </ds:schemaRefs>
-</ds:datastoreItem>
+<file path=customXml/item4.xml><?xml version="1.0" encoding="utf-8"?>
+<b:Sources xmlns:b="http://schemas.openxmlformats.org/officeDocument/2006/bibliography" xmlns="http://schemas.openxmlformats.org/officeDocument/2006/bibliography" SelectedStyle="\APASixthEditionOfficeOnline.xsl" StyleName="APA" Version="6"/>
 </file>
 
-<file path=customXml/itemProps2.xml><?xml version="1.0" encoding="utf-8"?>
+<file path=customXml/itemProps1.xml><?xml version="1.0" encoding="utf-8"?>
 <ds:datastoreItem xmlns:ds="http://schemas.openxmlformats.org/officeDocument/2006/customXml" ds:itemID="{40E4B8C6-B1C9-4185-9639-FEFD39A17556}">
   <ds:schemaRefs>
     <ds:schemaRef ds:uri="http://schemas.microsoft.com/office/2006/metadata/properties"/>
@@ -25599,15 +25414,15 @@
 </ds:datastoreItem>
 </file>
 
-<file path=customXml/itemProps3.xml><?xml version="1.0" encoding="utf-8"?>
-<ds:datastoreItem xmlns:ds="http://schemas.openxmlformats.org/officeDocument/2006/customXml" ds:itemID="{76489EEC-0EA0-4128-BBF7-50A2FAD8EC62}">
+<file path=customXml/itemProps2.xml><?xml version="1.0" encoding="utf-8"?>
+<ds:datastoreItem xmlns:ds="http://schemas.openxmlformats.org/officeDocument/2006/customXml" ds:itemID="{75D03931-F062-4262-AB08-608FD6DEBE13}">
   <ds:schemaRefs>
-    <ds:schemaRef ds:uri="http://schemas.openxmlformats.org/officeDocument/2006/bibliography"/>
+    <ds:schemaRef ds:uri="http://schemas.microsoft.com/sharepoint/v3/contenttype/forms"/>
   </ds:schemaRefs>
 </ds:datastoreItem>
 </file>
 
-<file path=customXml/itemProps4.xml><?xml version="1.0" encoding="utf-8"?>
+<file path=customXml/itemProps3.xml><?xml version="1.0" encoding="utf-8"?>
 <ds:datastoreItem xmlns:ds="http://schemas.openxmlformats.org/officeDocument/2006/customXml" ds:itemID="{89F32633-F3F7-4819-B408-33E4F4698F8E}">
   <ds:schemaRefs>
     <ds:schemaRef ds:uri="http://schemas.microsoft.com/office/2006/metadata/contentType"/>
@@ -25623,4 +25438,12 @@
     <ds:schemaRef ds:uri="http://schemas.microsoft.com/internal/obd"/>
   </ds:schemaRefs>
 </ds:datastoreItem>
+</file>
+
+<file path=customXml/itemProps4.xml><?xml version="1.0" encoding="utf-8"?>
+<ds:datastoreItem xmlns:ds="http://schemas.openxmlformats.org/officeDocument/2006/customXml" ds:itemID="{76489EEC-0EA0-4128-BBF7-50A2FAD8EC62}">
+  <ds:schemaRefs>
+    <ds:schemaRef ds:uri="http://schemas.openxmlformats.org/officeDocument/2006/bibliography"/>
+  </ds:schemaRefs>
+</ds:datastoreItem>
 </file>
</xml_diff>